<commit_message>
Update Services copy: new messaging, taglines, and bullets
- Changed Service 1 title from "The AI Build" to "The AI Setup"
- Updated Service 1 tagline: "Move faster. Stronger output. Everything stays consistent."
- Refreshed Service 1 body copy and "Right For You If" bullets (4 new criteria)
- Updated Service 2 tagline: "Get clear on where to start."
- Services page hero headline: "AI tools are everywhere. Setups are rare."
- New hero body copy explaining the core problem and solution
- Updated Copy Deck with new messaging

Co-Authored-By: Claude Haiku 4.5 <noreply@anthropic.com>
</commit_message>
<xml_diff>
--- a/Reve_AI_Copy_Deck.docx
+++ b/Reve_AI_Copy_Deck.docx
@@ -118,27 +118,35 @@
         <w:spacing w:after="120"/>
       </w:pPr>
       <w:r>
-        <w:t xml:space="preserve">You're already using AI. We make it worth it.</w:t>
-      </w:r>
-    </w:p>
-    <w:p>
-      <w:pPr>
-        <w:spacing w:after="40"/>
-      </w:pPr>
-      <w:r>
-        <w:rPr>
-          <w:b/>
-          <w:bCs/>
-        </w:rPr>
-        <w:t xml:space="preserve">Subheading:</w:t>
-      </w:r>
-    </w:p>
-    <w:p>
-      <w:pPr>
-        <w:spacing w:after="120"/>
-      </w:pPr>
-      <w:r>
-        <w:t xml:space="preserve">AI should make your business easier to run. We help you set it up that way.</w:t>
+        <w:t xml:space="preserve">AI tools are everywhere. Setups are rare.</w:t>
+      </w:r>
+    </w:p>
+    <w:p>
+      <w:pPr>
+        <w:spacing w:after="40"/>
+      </w:pPr>
+      <w:r>
+        <w:rPr>
+          <w:b/>
+          <w:bCs/>
+        </w:rPr>
+        <w:t xml:space="preserve">Body:</w:t>
+      </w:r>
+    </w:p>
+    <w:p>
+      <w:pPr>
+        <w:spacing w:after="120"/>
+      </w:pPr>
+      <w:r>
+        <w:t xml:space="preserve">Most founders have AI tools. Almost none have the system behind them. Without clear workflows, team alignment, and consistency, output quality suffers. You spend as much time fixing AI drafts as you would writing them. And your token bill keeps climbing.</w:t>
+      </w:r>
+    </w:p>
+    <w:p>
+      <w:pPr>
+        <w:spacing w:after="120"/>
+      </w:pPr>
+      <w:r>
+        <w:t xml:space="preserve">The fix is a custom system built around your business.</w:t>
       </w:r>
     </w:p>
     <w:p>
@@ -282,7 +290,7 @@
         <w:pStyle w:val="Heading3"/>
       </w:pPr>
       <w:r>
-        <w:t xml:space="preserve">Service 01 - The AI Build</w:t>
+        <w:t xml:space="preserve">Service 01 - The AI Setup</w:t>
       </w:r>
     </w:p>
     <w:p>
@@ -302,7 +310,7 @@
         <w:spacing w:after="120"/>
       </w:pPr>
       <w:r>
-        <w:t xml:space="preserve">We build your AI system, then train your team to run it.</w:t>
+        <w:t xml:space="preserve">Move faster. Stronger output. Everything stays consistent.</w:t>
       </w:r>
     </w:p>
     <w:p>
@@ -322,7 +330,7 @@
         <w:spacing w:after="120"/>
       </w:pPr>
       <w:r>
-        <w:t xml:space="preserve">A custom build for founder-led service businesses. We capture how your business thinks, build the workflows your team uses every day, and train your people to run it without you.</w:t>
+        <w:t xml:space="preserve">We build the workflows, align your team, and make sure everything works together. So you move faster, output quality improves, and nothing falls through the cracks.</w:t>
       </w:r>
     </w:p>
     <w:p>
@@ -339,20 +347,25 @@
     </w:p>
     <w:p>
       <w:r>
-        <w:t xml:space="preserve">• You are experimenting with AI but getting inconsistent results</w:t>
-      </w:r>
-    </w:p>
-    <w:p>
-      <w:r>
-        <w:t xml:space="preserve">• You want a system your team can run without you in the middle</w:t>
-      </w:r>
-    </w:p>
-    <w:p>
-      <w:pPr>
-        <w:spacing w:after="120"/>
-      </w:pPr>
-      <w:r>
-        <w:t xml:space="preserve">• You are ready to turn experimentation into something that actually runs</w:t>
+        <w:t xml:space="preserve">• You're using AI but you're not sure if you're using it right</w:t>
+      </w:r>
+    </w:p>
+    <w:p>
+      <w:r>
+        <w:t xml:space="preserve">• You have the tools (Claude, ChatGPT, Slack, email, Shopify, Klaviyo) but they're not working together as a system</w:t>
+      </w:r>
+    </w:p>
+    <w:p>
+      <w:r>
+        <w:t xml:space="preserve">• Everyone on your team is working differently with AI</w:t>
+      </w:r>
+    </w:p>
+    <w:p>
+      <w:pPr>
+        <w:spacing w:after="120"/>
+      </w:pPr>
+      <w:r>
+        <w:t xml:space="preserve">• You're spending more time fixing outputs than actually creating</w:t>
       </w:r>
     </w:p>
     <w:p>
@@ -400,7 +413,7 @@
         <w:spacing w:after="120"/>
       </w:pPr>
       <w:r>
-        <w:t xml:space="preserve">A 90-minute working session that shows you exactly where to start.</w:t>
+        <w:t xml:space="preserve">Get clear on where to start.</w:t>
       </w:r>
     </w:p>
     <w:p>
@@ -420,7 +433,7 @@
         <w:spacing w:after="120"/>
       </w:pPr>
       <w:r>
-        <w:t xml:space="preserve">Before you build anything, get clarity. We look at your business, your team and how you work — then tell you where AI belongs, what to stop doing manually and what your first three workflows should be.</w:t>
+        <w:t xml:space="preserve">Before you build anything, get clarity. We look at your business, your team and how you work, then show you exactly where AI belongs, what to stop doing manually, and what your first three workflows should be.</w:t>
       </w:r>
     </w:p>
     <w:p>
@@ -432,7 +445,7 @@
           <w:b/>
           <w:bCs/>
         </w:rPr>
-        <w:t xml:space="preserve">Right for you if:</w:t>
+        <w:t xml:space="preserve">You leave with:</w:t>
       </w:r>
     </w:p>
     <w:p>

</xml_diff>

<commit_message>
Revert Services page and Copy Deck to original state
Keeping only homepage Services component updates (new taglines and copy).
Services page and Copy Deck remain unchanged as requested.

Co-Authored-By: Claude Haiku 4.5 <noreply@anthropic.com>
</commit_message>
<xml_diff>
--- a/Reve_AI_Copy_Deck.docx
+++ b/Reve_AI_Copy_Deck.docx
@@ -118,7 +118,95 @@
         <w:spacing w:after="120"/>
       </w:pPr>
       <w:r>
-        <w:t xml:space="preserve">AI tools are everywhere. Setups are rare.</w:t>
+        <w:t xml:space="preserve">You're already using AI. We make it worth it.</w:t>
+      </w:r>
+    </w:p>
+    <w:p>
+      <w:pPr>
+        <w:spacing w:after="40"/>
+      </w:pPr>
+      <w:r>
+        <w:rPr>
+          <w:b/>
+          <w:bCs/>
+        </w:rPr>
+        <w:t xml:space="preserve">Subheading:</w:t>
+      </w:r>
+    </w:p>
+    <w:p>
+      <w:pPr>
+        <w:spacing w:after="120"/>
+      </w:pPr>
+      <w:r>
+        <w:t xml:space="preserve">AI should make your business easier to run. We help you set it up that way.</w:t>
+      </w:r>
+    </w:p>
+    <w:p>
+      <w:pPr>
+        <w:spacing w:after="40"/>
+      </w:pPr>
+      <w:r>
+        <w:rPr>
+          <w:b/>
+          <w:bCs/>
+        </w:rPr>
+        <w:t xml:space="preserve">CTA:</w:t>
+      </w:r>
+    </w:p>
+    <w:p>
+      <w:pPr>
+        <w:spacing w:after="200"/>
+      </w:pPr>
+      <w:r>
+        <w:t xml:space="preserve">Book a Call →</w:t>
+      </w:r>
+    </w:p>
+    <w:p>
+      <w:pPr>
+        <w:pStyle w:val="Heading2"/>
+      </w:pPr>
+      <w:r>
+        <w:t xml:space="preserve">The Problem</w:t>
+      </w:r>
+    </w:p>
+    <w:p>
+      <w:pPr>
+        <w:spacing w:after="40"/>
+      </w:pPr>
+      <w:r>
+        <w:rPr>
+          <w:b/>
+          <w:bCs/>
+        </w:rPr>
+        <w:t xml:space="preserve">Section Label:</w:t>
+      </w:r>
+    </w:p>
+    <w:p>
+      <w:pPr>
+        <w:spacing w:after="120"/>
+      </w:pPr>
+      <w:r>
+        <w:t xml:space="preserve">— The Problem</w:t>
+      </w:r>
+    </w:p>
+    <w:p>
+      <w:pPr>
+        <w:spacing w:after="40"/>
+      </w:pPr>
+      <w:r>
+        <w:rPr>
+          <w:b/>
+          <w:bCs/>
+        </w:rPr>
+        <w:t xml:space="preserve">Headline:</w:t>
+      </w:r>
+    </w:p>
+    <w:p>
+      <w:pPr>
+        <w:spacing w:after="120"/>
+      </w:pPr>
+      <w:r>
+        <w:t xml:space="preserve">Most founders are already using AI. Very few have the right setup behind it.</w:t>
       </w:r>
     </w:p>
     <w:p>
@@ -135,18 +223,136 @@
     </w:p>
     <w:p>
       <w:pPr>
-        <w:spacing w:after="120"/>
-      </w:pPr>
-      <w:r>
-        <w:t xml:space="preserve">Most founders have AI tools. Almost none have the system behind them. Without clear workflows, team alignment, and consistency, output quality suffers. You spend as much time fixing AI drafts as you would writing them. And your token bill keeps climbing.</w:t>
-      </w:r>
-    </w:p>
-    <w:p>
-      <w:pPr>
-        <w:spacing w:after="120"/>
-      </w:pPr>
-      <w:r>
-        <w:t xml:space="preserve">The fix is a custom system built around your business.</w:t>
+        <w:spacing w:after="200"/>
+      </w:pPr>
+      <w:r>
+        <w:t xml:space="preserve">The tool is not the problem. The setup is. Without the right foundation, brand voice, clear direction, and repeatable workflows, AI output looks almost right. Almost right still means fixing everything before it goes out.</w:t>
+      </w:r>
+    </w:p>
+    <w:p>
+      <w:pPr>
+        <w:pStyle w:val="Heading2"/>
+      </w:pPr>
+      <w:r>
+        <w:t xml:space="preserve">Services Section</w:t>
+      </w:r>
+    </w:p>
+    <w:p>
+      <w:pPr>
+        <w:spacing w:after="40"/>
+      </w:pPr>
+      <w:r>
+        <w:rPr>
+          <w:b/>
+          <w:bCs/>
+        </w:rPr>
+        <w:t xml:space="preserve">Section Label:</w:t>
+      </w:r>
+    </w:p>
+    <w:p>
+      <w:pPr>
+        <w:spacing w:after="120"/>
+      </w:pPr>
+      <w:r>
+        <w:t xml:space="preserve">— Services</w:t>
+      </w:r>
+    </w:p>
+    <w:p>
+      <w:pPr>
+        <w:spacing w:after="40"/>
+      </w:pPr>
+      <w:r>
+        <w:rPr>
+          <w:b/>
+          <w:bCs/>
+        </w:rPr>
+        <w:t xml:space="preserve">Headline:</w:t>
+      </w:r>
+    </w:p>
+    <w:p>
+      <w:pPr>
+        <w:spacing w:after="200"/>
+      </w:pPr>
+      <w:r>
+        <w:t xml:space="preserve">Two ways to work together.</w:t>
+      </w:r>
+    </w:p>
+    <w:p>
+      <w:pPr>
+        <w:pStyle w:val="Heading3"/>
+      </w:pPr>
+      <w:r>
+        <w:t xml:space="preserve">Service 01 - The AI Build</w:t>
+      </w:r>
+    </w:p>
+    <w:p>
+      <w:pPr>
+        <w:spacing w:after="40"/>
+      </w:pPr>
+      <w:r>
+        <w:rPr>
+          <w:b/>
+          <w:bCs/>
+        </w:rPr>
+        <w:t xml:space="preserve">Tagline:</w:t>
+      </w:r>
+    </w:p>
+    <w:p>
+      <w:pPr>
+        <w:spacing w:after="120"/>
+      </w:pPr>
+      <w:r>
+        <w:t xml:space="preserve">We build your AI system, then train your team to run it.</w:t>
+      </w:r>
+    </w:p>
+    <w:p>
+      <w:pPr>
+        <w:spacing w:after="40"/>
+      </w:pPr>
+      <w:r>
+        <w:rPr>
+          <w:b/>
+          <w:bCs/>
+        </w:rPr>
+        <w:t xml:space="preserve">Body:</w:t>
+      </w:r>
+    </w:p>
+    <w:p>
+      <w:pPr>
+        <w:spacing w:after="120"/>
+      </w:pPr>
+      <w:r>
+        <w:t xml:space="preserve">A custom build for founder-led service businesses. We capture how your business thinks, build the workflows your team uses every day, and train your people to run it without you.</w:t>
+      </w:r>
+    </w:p>
+    <w:p>
+      <w:pPr>
+        <w:spacing w:after="80"/>
+      </w:pPr>
+      <w:r>
+        <w:rPr>
+          <w:b/>
+          <w:bCs/>
+        </w:rPr>
+        <w:t xml:space="preserve">Right for you if:</w:t>
+      </w:r>
+    </w:p>
+    <w:p>
+      <w:r>
+        <w:t xml:space="preserve">• You are experimenting with AI but getting inconsistent results</w:t>
+      </w:r>
+    </w:p>
+    <w:p>
+      <w:r>
+        <w:t xml:space="preserve">• You want a system your team can run without you in the middle</w:t>
+      </w:r>
+    </w:p>
+    <w:p>
+      <w:pPr>
+        <w:spacing w:after="120"/>
+      </w:pPr>
+      <w:r>
+        <w:t xml:space="preserve">• You are ready to turn experimentation into something that actually runs</w:t>
       </w:r>
     </w:p>
     <w:p>
@@ -166,55 +372,35 @@
         <w:spacing w:after="200"/>
       </w:pPr>
       <w:r>
-        <w:t xml:space="preserve">Book a Call →</w:t>
-      </w:r>
-    </w:p>
-    <w:p>
-      <w:pPr>
-        <w:pStyle w:val="Heading2"/>
-      </w:pPr>
-      <w:r>
-        <w:t xml:space="preserve">The Problem</w:t>
-      </w:r>
-    </w:p>
-    <w:p>
-      <w:pPr>
-        <w:spacing w:after="40"/>
-      </w:pPr>
-      <w:r>
-        <w:rPr>
-          <w:b/>
-          <w:bCs/>
-        </w:rPr>
-        <w:t xml:space="preserve">Section Label:</w:t>
-      </w:r>
-    </w:p>
-    <w:p>
-      <w:pPr>
-        <w:spacing w:after="120"/>
-      </w:pPr>
-      <w:r>
-        <w:t xml:space="preserve">— The Problem</w:t>
-      </w:r>
-    </w:p>
-    <w:p>
-      <w:pPr>
-        <w:spacing w:after="40"/>
-      </w:pPr>
-      <w:r>
-        <w:rPr>
-          <w:b/>
-          <w:bCs/>
-        </w:rPr>
-        <w:t xml:space="preserve">Headline:</w:t>
-      </w:r>
-    </w:p>
-    <w:p>
-      <w:pPr>
-        <w:spacing w:after="120"/>
-      </w:pPr>
-      <w:r>
-        <w:t xml:space="preserve">Most founders are already using AI. Very few have the right setup behind it.</w:t>
+        <w:t xml:space="preserve">Learn More →</w:t>
+      </w:r>
+    </w:p>
+    <w:p>
+      <w:pPr>
+        <w:pStyle w:val="Heading3"/>
+      </w:pPr>
+      <w:r>
+        <w:t xml:space="preserve">Service 02 - AI Strategy Session</w:t>
+      </w:r>
+    </w:p>
+    <w:p>
+      <w:pPr>
+        <w:spacing w:after="40"/>
+      </w:pPr>
+      <w:r>
+        <w:rPr>
+          <w:b/>
+          <w:bCs/>
+        </w:rPr>
+        <w:t xml:space="preserve">Tagline:</w:t>
+      </w:r>
+    </w:p>
+    <w:p>
+      <w:pPr>
+        <w:spacing w:after="120"/>
+      </w:pPr>
+      <w:r>
+        <w:t xml:space="preserve">A 90-minute working session that shows you exactly where to start.</w:t>
       </w:r>
     </w:p>
     <w:p>
@@ -231,106 +417,10 @@
     </w:p>
     <w:p>
       <w:pPr>
-        <w:spacing w:after="200"/>
-      </w:pPr>
-      <w:r>
-        <w:t xml:space="preserve">The tool is not the problem. The setup is. Without the right foundation, brand voice, clear direction, and repeatable workflows, AI output looks almost right. Almost right still means fixing everything before it goes out.</w:t>
-      </w:r>
-    </w:p>
-    <w:p>
-      <w:pPr>
-        <w:pStyle w:val="Heading2"/>
-      </w:pPr>
-      <w:r>
-        <w:t xml:space="preserve">Services Section</w:t>
-      </w:r>
-    </w:p>
-    <w:p>
-      <w:pPr>
-        <w:spacing w:after="40"/>
-      </w:pPr>
-      <w:r>
-        <w:rPr>
-          <w:b/>
-          <w:bCs/>
-        </w:rPr>
-        <w:t xml:space="preserve">Section Label:</w:t>
-      </w:r>
-    </w:p>
-    <w:p>
-      <w:pPr>
-        <w:spacing w:after="120"/>
-      </w:pPr>
-      <w:r>
-        <w:t xml:space="preserve">— Services</w:t>
-      </w:r>
-    </w:p>
-    <w:p>
-      <w:pPr>
-        <w:spacing w:after="40"/>
-      </w:pPr>
-      <w:r>
-        <w:rPr>
-          <w:b/>
-          <w:bCs/>
-        </w:rPr>
-        <w:t xml:space="preserve">Headline:</w:t>
-      </w:r>
-    </w:p>
-    <w:p>
-      <w:pPr>
-        <w:spacing w:after="200"/>
-      </w:pPr>
-      <w:r>
-        <w:t xml:space="preserve">Two ways to work together.</w:t>
-      </w:r>
-    </w:p>
-    <w:p>
-      <w:pPr>
-        <w:pStyle w:val="Heading3"/>
-      </w:pPr>
-      <w:r>
-        <w:t xml:space="preserve">Service 01 - The AI Setup</w:t>
-      </w:r>
-    </w:p>
-    <w:p>
-      <w:pPr>
-        <w:spacing w:after="40"/>
-      </w:pPr>
-      <w:r>
-        <w:rPr>
-          <w:b/>
-          <w:bCs/>
-        </w:rPr>
-        <w:t xml:space="preserve">Tagline:</w:t>
-      </w:r>
-    </w:p>
-    <w:p>
-      <w:pPr>
-        <w:spacing w:after="120"/>
-      </w:pPr>
-      <w:r>
-        <w:t xml:space="preserve">Move faster. Stronger output. Everything stays consistent.</w:t>
-      </w:r>
-    </w:p>
-    <w:p>
-      <w:pPr>
-        <w:spacing w:after="40"/>
-      </w:pPr>
-      <w:r>
-        <w:rPr>
-          <w:b/>
-          <w:bCs/>
-        </w:rPr>
-        <w:t xml:space="preserve">Body:</w:t>
-      </w:r>
-    </w:p>
-    <w:p>
-      <w:pPr>
-        <w:spacing w:after="120"/>
-      </w:pPr>
-      <w:r>
-        <w:t xml:space="preserve">We build the workflows, align your team, and make sure everything works together. So you move faster, output quality improves, and nothing falls through the cracks.</w:t>
+        <w:spacing w:after="120"/>
+      </w:pPr>
+      <w:r>
+        <w:t xml:space="preserve">Before you build anything, get clarity. We look at your business, your team and how you work — then tell you where AI belongs, what to stop doing manually and what your first three workflows should be.</w:t>
       </w:r>
     </w:p>
     <w:p>
@@ -343,109 +433,6 @@
           <w:bCs/>
         </w:rPr>
         <w:t xml:space="preserve">Right for you if:</w:t>
-      </w:r>
-    </w:p>
-    <w:p>
-      <w:r>
-        <w:t xml:space="preserve">• You're using AI but you're not sure if you're using it right</w:t>
-      </w:r>
-    </w:p>
-    <w:p>
-      <w:r>
-        <w:t xml:space="preserve">• You have the tools (Claude, ChatGPT, Slack, email, Shopify, Klaviyo) but they're not working together as a system</w:t>
-      </w:r>
-    </w:p>
-    <w:p>
-      <w:r>
-        <w:t xml:space="preserve">• Everyone on your team is working differently with AI</w:t>
-      </w:r>
-    </w:p>
-    <w:p>
-      <w:pPr>
-        <w:spacing w:after="120"/>
-      </w:pPr>
-      <w:r>
-        <w:t xml:space="preserve">• You're spending more time fixing outputs than actually creating</w:t>
-      </w:r>
-    </w:p>
-    <w:p>
-      <w:pPr>
-        <w:spacing w:after="40"/>
-      </w:pPr>
-      <w:r>
-        <w:rPr>
-          <w:b/>
-          <w:bCs/>
-        </w:rPr>
-        <w:t xml:space="preserve">CTA:</w:t>
-      </w:r>
-    </w:p>
-    <w:p>
-      <w:pPr>
-        <w:spacing w:after="200"/>
-      </w:pPr>
-      <w:r>
-        <w:t xml:space="preserve">Learn More →</w:t>
-      </w:r>
-    </w:p>
-    <w:p>
-      <w:pPr>
-        <w:pStyle w:val="Heading3"/>
-      </w:pPr>
-      <w:r>
-        <w:t xml:space="preserve">Service 02 - AI Strategy Session</w:t>
-      </w:r>
-    </w:p>
-    <w:p>
-      <w:pPr>
-        <w:spacing w:after="40"/>
-      </w:pPr>
-      <w:r>
-        <w:rPr>
-          <w:b/>
-          <w:bCs/>
-        </w:rPr>
-        <w:t xml:space="preserve">Tagline:</w:t>
-      </w:r>
-    </w:p>
-    <w:p>
-      <w:pPr>
-        <w:spacing w:after="120"/>
-      </w:pPr>
-      <w:r>
-        <w:t xml:space="preserve">Get clear on where to start.</w:t>
-      </w:r>
-    </w:p>
-    <w:p>
-      <w:pPr>
-        <w:spacing w:after="40"/>
-      </w:pPr>
-      <w:r>
-        <w:rPr>
-          <w:b/>
-          <w:bCs/>
-        </w:rPr>
-        <w:t xml:space="preserve">Body:</w:t>
-      </w:r>
-    </w:p>
-    <w:p>
-      <w:pPr>
-        <w:spacing w:after="120"/>
-      </w:pPr>
-      <w:r>
-        <w:t xml:space="preserve">Before you build anything, get clarity. We look at your business, your team and how you work, then show you exactly where AI belongs, what to stop doing manually, and what your first three workflows should be.</w:t>
-      </w:r>
-    </w:p>
-    <w:p>
-      <w:pPr>
-        <w:spacing w:after="80"/>
-      </w:pPr>
-      <w:r>
-        <w:rPr>
-          <w:b/>
-          <w:bCs/>
-        </w:rPr>
-        <w:t xml:space="preserve">You leave with:</w:t>
       </w:r>
     </w:p>
     <w:p>

</xml_diff>